<commit_message>
Update report header with student name and remove institution and date
</commit_message>
<xml_diff>
--- a/docs/Assignment_4_Facade_Pattern_Report.docx
+++ b/docs/Assignment_4_Facade_Pattern_Report.docx
@@ -42,17 +42,10 @@
           <w:b w:val="0"/>
           <w:color w:val="000000"/>
         </w:rPr>
-        <w:t>Astana IT University  |  School of Computer Engineering</w:t>
+        <w:t>Ziyadinkhan Kudaibergenuly</w:t>
       </w:r>
     </w:p>
     <w:p>
-      <w:r>
-        <w:rPr>
-          <w:rFonts w:ascii="Times New Roman" w:hAnsi="Times New Roman" w:eastAsia="Times New Roman" w:cs="Times New Roman"/>
-          <w:b w:val="0"/>
-          <w:color w:val="000000"/>
-        </w:rPr>
-      </w:r>
       <w:r>
         <w:rPr>
           <w:rFonts w:ascii="Times New Roman" w:hAnsi="Times New Roman" w:eastAsia="Times New Roman" w:cs="Times New Roman"/>
@@ -84,23 +77,7 @@
           <w:b w:val="0"/>
           <w:color w:val="000000"/>
         </w:rPr>
-        <w:t xml:space="preserve"> Java 17  |  </w:t>
-      </w:r>
-      <w:r>
-        <w:rPr>
-          <w:rFonts w:ascii="Times New Roman" w:hAnsi="Times New Roman" w:eastAsia="Times New Roman" w:cs="Times New Roman"/>
-          <w:b/>
-          <w:color w:val="000000"/>
-        </w:rPr>
-        <w:t>Report date:</w:t>
-      </w:r>
-      <w:r>
-        <w:rPr>
-          <w:rFonts w:ascii="Times New Roman" w:hAnsi="Times New Roman" w:eastAsia="Times New Roman" w:cs="Times New Roman"/>
-          <w:b w:val="0"/>
-          <w:color w:val="000000"/>
-        </w:rPr>
-        <w:t xml:space="preserve"> 11 October 2026</w:t>
+        <w:t xml:space="preserve"> Java 17</w:t>
       </w:r>
     </w:p>
     <w:p>

</xml_diff>

<commit_message>
Expand console demo with setup steps, device state, and shutdown details
</commit_message>
<xml_diff>
--- a/docs/Assignment_4_Facade_Pattern_Report.docx
+++ b/docs/Assignment_4_Facade_Pattern_Report.docx
@@ -824,7 +824,7 @@
           <w:b w:val="0"/>
           <w:color w:val="000000"/>
         </w:rPr>
-        <w:t xml:space="preserve"> accepts test fixtures without exposing device types in the public API. Both public session operations return confirmation strings.</w:t>
+        <w:t xml:space="preserve"> accepts test fixtures without exposing device types in the public API. Both public session operations return readable session reports.</w:t>
       </w:r>
     </w:p>
     <w:p>
@@ -3689,7 +3689,7 @@
           <w:b w:val="0"/>
           <w:color w:val="000000"/>
         </w:rPr>
-        <w:t xml:space="preserve">From the repository root, run </w:t>
+        <w:t xml:space="preserve">Run </w:t>
       </w:r>
       <w:r>
         <w:rPr>
@@ -3721,7 +3721,23 @@
           <w:b w:val="0"/>
           <w:color w:val="000000"/>
         </w:rPr>
-        <w:t>. In IntelliJ IDEA, select JDK 17 and run Client.main or HomeTheaterTests.main. The default client produces the following verified output.</w:t>
+        <w:t xml:space="preserve"> from the repository root. The expanded demo shows numbered setup steps, device states, the image diagonal, and shutdown. Selected final messages appear below; the full verified transcript is in </w:t>
+      </w:r>
+      <w:r>
+        <w:rPr>
+          <w:rFonts w:ascii="Times New Roman" w:hAnsi="Times New Roman" w:eastAsia="Times New Roman" w:cs="Times New Roman"/>
+          <w:b/>
+          <w:color w:val="000000"/>
+        </w:rPr>
+        <w:t>docs/demo-output.txt</w:t>
+      </w:r>
+      <w:r>
+        <w:rPr>
+          <w:rFonts w:ascii="Times New Roman" w:hAnsi="Times New Roman" w:eastAsia="Times New Roman" w:cs="Times New Roman"/>
+          <w:b w:val="0"/>
+          <w:color w:val="000000"/>
+        </w:rPr>
+        <w:t>.</w:t>
       </w:r>
     </w:p>
     <w:p>

</xml_diff>